<commit_message>
Docs: align all login/deploy docs with production behaviour
The login docs still promised "demo quick-login buttons" / "pick a demo role,"
which is no longer accurate: the member picker is off in production by default,
and one-click demo sign-in only appears in dev when DEMO_PASSWORD is set. Update
every doc that describes signing in — README, DEPLOYMENT, USER_GUIDE,
CONTRIBUTING, and the demo-kit README / User-Guide / Runbook — to state the real
behaviour consistently: dev lists demo members (one-click when DEMO_PASSWORD is
set, else prefill + typed password); production hides the picker
(SHOW_LOGIN_MEMBER_PICKER=true re-enables it); demo accounts share the
DEMO_PASSWORD password. Also fill in the full role list (adds CSM + Admin) and
regenerate the demo-kit User-Guide .docx/.pdf.

Co-Authored-By: Claude Opus 4.8 <noreply@anthropic.com>
</commit_message>
<xml_diff>
--- a/demo-kit/ValueLifecycle-User-Guide.docx
+++ b/demo-kit/ValueLifecycle-User-Guide.docx
@@ -509,17 +509,27 @@
         <w:spacing w:after="120" w:line="264"/>
       </w:pPr>
       <w:r>
-        <w:t xml:space="preserve">Open the app and you land on the sign-in page. Enter your email and password, or use a </w:t>
-      </w:r>
-      <w:r>
-        <w:rPr>
-          <w:b/>
-          <w:bCs/>
-        </w:rPr>
-        <w:t xml:space="preserve">demo quick-login</w:t>
-      </w:r>
-      <w:r>
-        <w:t xml:space="preserve"> button to jump in as a specific role. To experience the separation of duties, sign out and sign back in as a different person — the navigation and the buttons you see change with your role.</w:t>
+        <w:t xml:space="preserve">Open the app and you land on the sign-in page. Enter your email and password. In a local demo the sign-in screen also lists the demo workspace's members, so you can jump straight in as a specific role — </w:t>
+      </w:r>
+      <w:r>
+        <w:rPr>
+          <w:b/>
+          <w:bCs/>
+        </w:rPr>
+        <w:t xml:space="preserve">one-click when `DEMO_PASSWORD` is set</w:t>
+      </w:r>
+      <w:r>
+        <w:t xml:space="preserve">, otherwise pick a member to prefill their email and type the password. (This member list is </w:t>
+      </w:r>
+      <w:r>
+        <w:rPr>
+          <w:b/>
+          <w:bCs/>
+        </w:rPr>
+        <w:t xml:space="preserve">off in production</w:t>
+      </w:r>
+      <w:r>
+        <w:t xml:space="preserve"> by default.) To experience the separation of duties, sign out and sign back in as a different person — the navigation and the buttons you see change with your role.</w:t>
       </w:r>
     </w:p>
     <w:p>

</xml_diff>

<commit_message>
demo-kit: reconcile industry framing with the seed's solution profiles
Sweep the leftover generic-vertical framing (construction / manufacturing /
SaaS 'industries') to match the app's actual four solution profiles —
Workload Automation, Mainframe Optimization, Service & Operations, Software
Reseller — and the Industry->Solution rename. Also fixes a stale 'defaults
to ZAR' (now USD) in the User Guide.

Touched: User Guide (.md/.docx/.pdf), Design Document (.md + hardcoded
build-design-docx.js, regenerated .docx), Solution-Overview deck
(build-deck.js, regenerated .pptx/.pdf), and the industry-config diagram
(make-diagrams.js, regenerated PNG/SVG). Wording kept vendor-neutral.

Co-Authored-By: Claude Opus 4.8 <noreply@anthropic.com>
</commit_message>
<xml_diff>
--- a/demo-kit/ValueLifecycle-User-Guide.docx
+++ b/demo-kit/ValueLifecycle-User-Guide.docx
@@ -1704,10 +1704,10 @@
           <w:b/>
           <w:bCs/>
         </w:rPr>
-        <w:t xml:space="preserve">industry profile</w:t>
-      </w:r>
-      <w:r>
-        <w:t xml:space="preserve"> (Construction, Manufacturing or SaaS — this tailors the study types, cost drivers, value levers and default KPIs), choose the </w:t>
+        <w:t xml:space="preserve">solution profile</w:t>
+      </w:r>
+      <w:r>
+        <w:t xml:space="preserve"> (Workload Automation, Mainframe Optimization, Service &amp; Operations or Software Reseller — this tailors the study types, cost drivers, value levers and default KPIs), choose the </w:t>
       </w:r>
       <w:r>
         <w:rPr>
@@ -1727,7 +1727,7 @@
         <w:t xml:space="preserve">currency</w:t>
       </w:r>
       <w:r>
-        <w:t xml:space="preserve"> (defaults to ZAR), and write a one-line </w:t>
+        <w:t xml:space="preserve"> (defaults to USD), and write a one-line </w:t>
       </w:r>
       <w:r>
         <w:rPr>

</xml_diff>